<commit_message>
Add blank line between every paragraph and heading (test on one doc)
Kevins Vorgabe: zwischen jedem Absatz und jeder Ueberschrift steht
immer eine echte Leerzeile. buildDoc() fuegt sie jetzt automatisch
zwischen allen Elementen ein, die einzelnen Hilfsfunktionen tragen
selbst keinen Abstand mehr (spacing auf 0), damit sich nichts addiert.
Zunaechst nur auf Recognize-You-Email-DIY-Einwand.docx angewendet,
zur Abnahme, bevor es auf die anderen vier Dokumente uebertragen wird.

Co-Authored-By: Claude Sonnet 5 <noreply@anthropic.com>
Claude-Session: https://claude.ai/code/session_01DeqSdBatYE6t9FA6GS9TPf
</commit_message>
<xml_diff>
--- a/vertrieb/Recognize-You-Email-DIY-Einwand.docx
+++ b/vertrieb/Recognize-You-Email-DIY-Einwand.docx
@@ -4,7 +4,7 @@
   <w:body>
     <w:p>
       <w:pPr>
-        <w:spacing w:after="100"/>
+        <w:spacing w:after="0" w:before="0"/>
       </w:pPr>
       <w:r>
         <w:rPr>
@@ -19,7 +19,20 @@
     </w:p>
     <w:p>
       <w:pPr>
-        <w:spacing w:after="110"/>
+        <w:spacing w:after="0" w:before="0"/>
+      </w:pPr>
+      <w:r>
+        <w:rPr>
+          <w:rFonts w:ascii="Calibri" w:cs="Calibri" w:eastAsia="Calibri" w:hAnsi="Calibri"/>
+          <w:sz w:val="22"/>
+          <w:szCs w:val="22"/>
+        </w:rPr>
+        <w:t xml:space="preserve"/>
+      </w:r>
+    </w:p>
+    <w:p>
+      <w:pPr>
+        <w:spacing w:after="0" w:before="0"/>
         <w:ind w:left="300"/>
       </w:pPr>
       <w:r>
@@ -37,7 +50,20 @@
     </w:p>
     <w:p>
       <w:pPr>
-        <w:spacing w:after="110"/>
+        <w:spacing w:after="0" w:before="0"/>
+      </w:pPr>
+      <w:r>
+        <w:rPr>
+          <w:rFonts w:ascii="Calibri" w:cs="Calibri" w:eastAsia="Calibri" w:hAnsi="Calibri"/>
+          <w:sz w:val="22"/>
+          <w:szCs w:val="22"/>
+        </w:rPr>
+        <w:t xml:space="preserve"/>
+      </w:r>
+    </w:p>
+    <w:p>
+      <w:pPr>
+        <w:spacing w:after="0" w:before="0"/>
         <w:ind w:left="300"/>
       </w:pPr>
       <w:r>
@@ -55,7 +81,20 @@
     </w:p>
     <w:p>
       <w:pPr>
-        <w:spacing w:after="110"/>
+        <w:spacing w:after="0" w:before="0"/>
+      </w:pPr>
+      <w:r>
+        <w:rPr>
+          <w:rFonts w:ascii="Calibri" w:cs="Calibri" w:eastAsia="Calibri" w:hAnsi="Calibri"/>
+          <w:sz w:val="22"/>
+          <w:szCs w:val="22"/>
+        </w:rPr>
+        <w:t xml:space="preserve"/>
+      </w:r>
+    </w:p>
+    <w:p>
+      <w:pPr>
+        <w:spacing w:after="0" w:before="0"/>
         <w:ind w:left="300"/>
       </w:pPr>
       <w:r>
@@ -73,7 +112,20 @@
     </w:p>
     <w:p>
       <w:pPr>
-        <w:spacing w:after="110"/>
+        <w:spacing w:after="0" w:before="0"/>
+      </w:pPr>
+      <w:r>
+        <w:rPr>
+          <w:rFonts w:ascii="Calibri" w:cs="Calibri" w:eastAsia="Calibri" w:hAnsi="Calibri"/>
+          <w:sz w:val="22"/>
+          <w:szCs w:val="22"/>
+        </w:rPr>
+        <w:t xml:space="preserve"/>
+      </w:r>
+    </w:p>
+    <w:p>
+      <w:pPr>
+        <w:spacing w:after="0" w:before="0"/>
         <w:ind w:left="300"/>
       </w:pPr>
       <w:r>
@@ -115,7 +167,20 @@
     </w:p>
     <w:p>
       <w:pPr>
-        <w:spacing w:after="110" w:before="280"/>
+        <w:spacing w:after="0" w:before="0"/>
+      </w:pPr>
+      <w:r>
+        <w:rPr>
+          <w:rFonts w:ascii="Calibri" w:cs="Calibri" w:eastAsia="Calibri" w:hAnsi="Calibri"/>
+          <w:sz w:val="22"/>
+          <w:szCs w:val="22"/>
+        </w:rPr>
+        <w:t xml:space="preserve"/>
+      </w:r>
+    </w:p>
+    <w:p>
+      <w:pPr>
+        <w:spacing w:after="0" w:before="0"/>
       </w:pPr>
       <w:r>
         <w:rPr>
@@ -130,7 +195,20 @@
     </w:p>
     <w:p>
       <w:pPr>
-        <w:spacing w:after="200"/>
+        <w:spacing w:after="0" w:before="0"/>
+      </w:pPr>
+      <w:r>
+        <w:rPr>
+          <w:rFonts w:ascii="Calibri" w:cs="Calibri" w:eastAsia="Calibri" w:hAnsi="Calibri"/>
+          <w:sz w:val="22"/>
+          <w:szCs w:val="22"/>
+        </w:rPr>
+        <w:t xml:space="preserve"/>
+      </w:r>
+    </w:p>
+    <w:p>
+      <w:pPr>
+        <w:spacing w:after="0" w:before="0"/>
       </w:pPr>
       <w:r>
         <w:rPr>
@@ -147,7 +225,20 @@
     </w:p>
     <w:p>
       <w:pPr>
-        <w:spacing w:after="110" w:before="280"/>
+        <w:spacing w:after="0" w:before="0"/>
+      </w:pPr>
+      <w:r>
+        <w:rPr>
+          <w:rFonts w:ascii="Calibri" w:cs="Calibri" w:eastAsia="Calibri" w:hAnsi="Calibri"/>
+          <w:sz w:val="22"/>
+          <w:szCs w:val="22"/>
+        </w:rPr>
+        <w:t xml:space="preserve"/>
+      </w:r>
+    </w:p>
+    <w:p>
+      <w:pPr>
+        <w:spacing w:after="0" w:before="0"/>
       </w:pPr>
       <w:r>
         <w:rPr>
@@ -162,7 +253,20 @@
     </w:p>
     <w:p>
       <w:pPr>
-        <w:spacing w:after="200"/>
+        <w:spacing w:after="0" w:before="0"/>
+      </w:pPr>
+      <w:r>
+        <w:rPr>
+          <w:rFonts w:ascii="Calibri" w:cs="Calibri" w:eastAsia="Calibri" w:hAnsi="Calibri"/>
+          <w:sz w:val="22"/>
+          <w:szCs w:val="22"/>
+        </w:rPr>
+        <w:t xml:space="preserve"/>
+      </w:r>
+    </w:p>
+    <w:p>
+      <w:pPr>
+        <w:spacing w:after="0" w:before="0"/>
       </w:pPr>
       <w:r>
         <w:rPr>
@@ -203,7 +307,20 @@
     </w:p>
     <w:p>
       <w:pPr>
-        <w:spacing w:after="200"/>
+        <w:spacing w:after="0" w:before="0"/>
+      </w:pPr>
+      <w:r>
+        <w:rPr>
+          <w:rFonts w:ascii="Calibri" w:cs="Calibri" w:eastAsia="Calibri" w:hAnsi="Calibri"/>
+          <w:sz w:val="22"/>
+          <w:szCs w:val="22"/>
+        </w:rPr>
+        <w:t xml:space="preserve"/>
+      </w:r>
+    </w:p>
+    <w:p>
+      <w:pPr>
+        <w:spacing w:after="0" w:before="0"/>
       </w:pPr>
       <w:r>
         <w:rPr>
@@ -220,7 +337,20 @@
     </w:p>
     <w:p>
       <w:pPr>
-        <w:spacing w:after="200"/>
+        <w:spacing w:after="0" w:before="0"/>
+      </w:pPr>
+      <w:r>
+        <w:rPr>
+          <w:rFonts w:ascii="Calibri" w:cs="Calibri" w:eastAsia="Calibri" w:hAnsi="Calibri"/>
+          <w:sz w:val="22"/>
+          <w:szCs w:val="22"/>
+        </w:rPr>
+        <w:t xml:space="preserve"/>
+      </w:r>
+    </w:p>
+    <w:p>
+      <w:pPr>
+        <w:spacing w:after="0" w:before="0"/>
       </w:pPr>
       <w:r>
         <w:rPr>
@@ -309,7 +439,20 @@
     </w:p>
     <w:p>
       <w:pPr>
-        <w:spacing w:after="200"/>
+        <w:spacing w:after="0" w:before="0"/>
+      </w:pPr>
+      <w:r>
+        <w:rPr>
+          <w:rFonts w:ascii="Calibri" w:cs="Calibri" w:eastAsia="Calibri" w:hAnsi="Calibri"/>
+          <w:sz w:val="22"/>
+          <w:szCs w:val="22"/>
+        </w:rPr>
+        <w:t xml:space="preserve"/>
+      </w:r>
+    </w:p>
+    <w:p>
+      <w:pPr>
+        <w:spacing w:after="0" w:before="0"/>
       </w:pPr>
       <w:r>
         <w:rPr>
@@ -326,7 +469,20 @@
     </w:p>
     <w:p>
       <w:pPr>
-        <w:spacing w:after="200"/>
+        <w:spacing w:after="0" w:before="0"/>
+      </w:pPr>
+      <w:r>
+        <w:rPr>
+          <w:rFonts w:ascii="Calibri" w:cs="Calibri" w:eastAsia="Calibri" w:hAnsi="Calibri"/>
+          <w:sz w:val="22"/>
+          <w:szCs w:val="22"/>
+        </w:rPr>
+        <w:t xml:space="preserve"/>
+      </w:r>
+    </w:p>
+    <w:p>
+      <w:pPr>
+        <w:spacing w:after="0" w:before="0"/>
       </w:pPr>
       <w:r>
         <w:rPr>
@@ -343,7 +499,20 @@
     </w:p>
     <w:p>
       <w:pPr>
-        <w:spacing w:after="200"/>
+        <w:spacing w:after="0" w:before="0"/>
+      </w:pPr>
+      <w:r>
+        <w:rPr>
+          <w:rFonts w:ascii="Calibri" w:cs="Calibri" w:eastAsia="Calibri" w:hAnsi="Calibri"/>
+          <w:sz w:val="22"/>
+          <w:szCs w:val="22"/>
+        </w:rPr>
+        <w:t xml:space="preserve"/>
+      </w:r>
+    </w:p>
+    <w:p>
+      <w:pPr>
+        <w:spacing w:after="0" w:before="0"/>
       </w:pPr>
       <w:r>
         <w:rPr>
@@ -360,12 +529,38 @@
     </w:p>
     <w:p>
       <w:pPr>
-        <w:spacing w:after="200"/>
-      </w:pPr>
-    </w:p>
-    <w:p>
-      <w:pPr>
-        <w:spacing w:after="200"/>
+        <w:spacing w:after="0" w:before="0"/>
+      </w:pPr>
+      <w:r>
+        <w:rPr>
+          <w:rFonts w:ascii="Calibri" w:cs="Calibri" w:eastAsia="Calibri" w:hAnsi="Calibri"/>
+          <w:sz w:val="22"/>
+          <w:szCs w:val="22"/>
+        </w:rPr>
+        <w:t xml:space="preserve"/>
+      </w:r>
+    </w:p>
+    <w:p>
+      <w:pPr>
+        <w:spacing w:after="0" w:before="0"/>
+      </w:pPr>
+    </w:p>
+    <w:p>
+      <w:pPr>
+        <w:spacing w:after="0" w:before="0"/>
+      </w:pPr>
+      <w:r>
+        <w:rPr>
+          <w:rFonts w:ascii="Calibri" w:cs="Calibri" w:eastAsia="Calibri" w:hAnsi="Calibri"/>
+          <w:sz w:val="22"/>
+          <w:szCs w:val="22"/>
+        </w:rPr>
+        <w:t xml:space="preserve"/>
+      </w:r>
+    </w:p>
+    <w:p>
+      <w:pPr>
+        <w:spacing w:after="0" w:before="0"/>
       </w:pPr>
       <w:r>
         <w:rPr>
@@ -382,7 +577,20 @@
     </w:p>
     <w:p>
       <w:pPr>
-        <w:spacing w:after="200"/>
+        <w:spacing w:after="0" w:before="0"/>
+      </w:pPr>
+      <w:r>
+        <w:rPr>
+          <w:rFonts w:ascii="Calibri" w:cs="Calibri" w:eastAsia="Calibri" w:hAnsi="Calibri"/>
+          <w:sz w:val="22"/>
+          <w:szCs w:val="22"/>
+        </w:rPr>
+        <w:t xml:space="preserve"/>
+      </w:r>
+    </w:p>
+    <w:p>
+      <w:pPr>
+        <w:spacing w:after="0" w:before="0"/>
       </w:pPr>
       <w:r>
         <w:rPr>
@@ -399,7 +607,20 @@
     </w:p>
     <w:p>
       <w:pPr>
-        <w:spacing w:after="200"/>
+        <w:spacing w:after="0" w:before="0"/>
+      </w:pPr>
+      <w:r>
+        <w:rPr>
+          <w:rFonts w:ascii="Calibri" w:cs="Calibri" w:eastAsia="Calibri" w:hAnsi="Calibri"/>
+          <w:sz w:val="22"/>
+          <w:szCs w:val="22"/>
+        </w:rPr>
+        <w:t xml:space="preserve"/>
+      </w:r>
+    </w:p>
+    <w:p>
+      <w:pPr>
+        <w:spacing w:after="0" w:before="0"/>
       </w:pPr>
       <w:r>
         <w:rPr>
@@ -416,7 +637,20 @@
     </w:p>
     <w:p>
       <w:pPr>
-        <w:spacing w:after="200"/>
+        <w:spacing w:after="0" w:before="0"/>
+      </w:pPr>
+      <w:r>
+        <w:rPr>
+          <w:rFonts w:ascii="Calibri" w:cs="Calibri" w:eastAsia="Calibri" w:hAnsi="Calibri"/>
+          <w:sz w:val="22"/>
+          <w:szCs w:val="22"/>
+        </w:rPr>
+        <w:t xml:space="preserve"/>
+      </w:r>
+    </w:p>
+    <w:p>
+      <w:pPr>
+        <w:spacing w:after="0" w:before="0"/>
       </w:pPr>
       <w:r>
         <w:rPr>
@@ -433,7 +667,20 @@
     </w:p>
     <w:p>
       <w:pPr>
-        <w:spacing w:after="110" w:before="280"/>
+        <w:spacing w:after="0" w:before="0"/>
+      </w:pPr>
+      <w:r>
+        <w:rPr>
+          <w:rFonts w:ascii="Calibri" w:cs="Calibri" w:eastAsia="Calibri" w:hAnsi="Calibri"/>
+          <w:sz w:val="22"/>
+          <w:szCs w:val="22"/>
+        </w:rPr>
+        <w:t xml:space="preserve"/>
+      </w:r>
+    </w:p>
+    <w:p>
+      <w:pPr>
+        <w:spacing w:after="0" w:before="0"/>
       </w:pPr>
       <w:r>
         <w:rPr>
@@ -448,7 +695,20 @@
     </w:p>
     <w:p>
       <w:pPr>
-        <w:spacing w:after="40"/>
+        <w:spacing w:after="0" w:before="0"/>
+      </w:pPr>
+      <w:r>
+        <w:rPr>
+          <w:rFonts w:ascii="Calibri" w:cs="Calibri" w:eastAsia="Calibri" w:hAnsi="Calibri"/>
+          <w:sz w:val="22"/>
+          <w:szCs w:val="22"/>
+        </w:rPr>
+        <w:t xml:space="preserve"/>
+      </w:r>
+    </w:p>
+    <w:p>
+      <w:pPr>
+        <w:spacing w:after="0" w:before="0"/>
         <w:ind w:left="106"/>
       </w:pPr>
       <w:r>
@@ -486,7 +746,20 @@
     </w:p>
     <w:p>
       <w:pPr>
-        <w:spacing w:after="40"/>
+        <w:spacing w:after="0" w:before="0"/>
+      </w:pPr>
+      <w:r>
+        <w:rPr>
+          <w:rFonts w:ascii="Calibri" w:cs="Calibri" w:eastAsia="Calibri" w:hAnsi="Calibri"/>
+          <w:sz w:val="22"/>
+          <w:szCs w:val="22"/>
+        </w:rPr>
+        <w:t xml:space="preserve"/>
+      </w:r>
+    </w:p>
+    <w:p>
+      <w:pPr>
+        <w:spacing w:after="0" w:before="0"/>
         <w:ind w:left="106"/>
       </w:pPr>
       <w:r>
@@ -524,7 +797,20 @@
     </w:p>
     <w:p>
       <w:pPr>
-        <w:spacing w:after="40"/>
+        <w:spacing w:after="0" w:before="0"/>
+      </w:pPr>
+      <w:r>
+        <w:rPr>
+          <w:rFonts w:ascii="Calibri" w:cs="Calibri" w:eastAsia="Calibri" w:hAnsi="Calibri"/>
+          <w:sz w:val="22"/>
+          <w:szCs w:val="22"/>
+        </w:rPr>
+        <w:t xml:space="preserve"/>
+      </w:r>
+    </w:p>
+    <w:p>
+      <w:pPr>
+        <w:spacing w:after="0" w:before="0"/>
         <w:ind w:left="106"/>
       </w:pPr>
       <w:r>

</xml_diff>

<commit_message>
Add tight-group spacing and new email signature
buildDoc() unterstuetzt jetzt "enge Gruppen" (Array als Kind-Element):
keine Leerzeile zwischen den enthaltenen Absaetzen, nur davor und
danach. Angewendet auf die drei Hinweiszeilen im Kopf des DIY-
Einwand-Dokuments, die eng zusammengehoeren.

Neue Signatur ("Lieben Dank und beste Gruesse", Geschaeftsfuehrer-
Titel, Slogan "Everything You Need", +49-Format, Postadresse) in
email-diy-einwand.md und email-nach-absage.md uebernommen. Adresse
und Slogan zusaetzlich in brand-basis.md als Firmenfakten ergaenzt.

Co-Authored-By: Claude Sonnet 5 <noreply@anthropic.com>
Claude-Session: https://claude.ai/code/session_01DeqSdBatYE6t9FA6GS9TPf
</commit_message>
<xml_diff>
--- a/vertrieb/Recognize-You-Email-DIY-Einwand.docx
+++ b/vertrieb/Recognize-You-Email-DIY-Einwand.docx
@@ -82,19 +82,6 @@
     <w:p>
       <w:pPr>
         <w:spacing w:after="0" w:before="0"/>
-      </w:pPr>
-      <w:r>
-        <w:rPr>
-          <w:rFonts w:ascii="Calibri" w:cs="Calibri" w:eastAsia="Calibri" w:hAnsi="Calibri"/>
-          <w:sz w:val="22"/>
-          <w:szCs w:val="22"/>
-        </w:rPr>
-        <w:t xml:space="preserve"/>
-      </w:r>
-    </w:p>
-    <w:p>
-      <w:pPr>
-        <w:spacing w:after="0" w:before="0"/>
         <w:ind w:left="300"/>
       </w:pPr>
       <w:r>
@@ -108,19 +95,6 @@
           <w:szCs w:val="19"/>
         </w:rPr>
         <w:t xml:space="preserve">Ton wie bei einem bestehenden Kunden: keine Beweisführung, keine Standardfloskeln, die Sache direkt ansprechen.</w:t>
-      </w:r>
-    </w:p>
-    <w:p>
-      <w:pPr>
-        <w:spacing w:after="0" w:before="0"/>
-      </w:pPr>
-      <w:r>
-        <w:rPr>
-          <w:rFonts w:ascii="Calibri" w:cs="Calibri" w:eastAsia="Calibri" w:hAnsi="Calibri"/>
-          <w:sz w:val="22"/>
-          <w:szCs w:val="22"/>
-        </w:rPr>
-        <w:t xml:space="preserve"/>
       </w:r>
     </w:p>
     <w:p>
@@ -494,56 +468,8 @@
           <w:sz w:val="22"/>
           <w:szCs w:val="22"/>
         </w:rPr>
-        <w:t xml:space="preserve">Viele Grüße</w:t>
-      </w:r>
-    </w:p>
-    <w:p>
-      <w:pPr>
-        <w:spacing w:after="0" w:before="0"/>
-      </w:pPr>
-      <w:r>
-        <w:rPr>
-          <w:rFonts w:ascii="Calibri" w:cs="Calibri" w:eastAsia="Calibri" w:hAnsi="Calibri"/>
-          <w:sz w:val="22"/>
-          <w:szCs w:val="22"/>
-        </w:rPr>
-        <w:t xml:space="preserve"/>
-      </w:r>
-    </w:p>
-    <w:p>
-      <w:pPr>
-        <w:spacing w:after="0" w:before="0"/>
-      </w:pPr>
-      <w:r>
-        <w:rPr>
-          <w:rFonts w:ascii="Calibri" w:cs="Calibri" w:eastAsia="Calibri" w:hAnsi="Calibri"/>
-          <w:b w:val="false"/>
-          <w:bCs w:val="false"/>
-          <w:i w:val="false"/>
-          <w:iCs w:val="false"/>
-          <w:sz w:val="22"/>
-          <w:szCs w:val="22"/>
-        </w:rPr>
-        <w:t xml:space="preserve">Kevin</w:t>
-      </w:r>
-    </w:p>
-    <w:p>
-      <w:pPr>
-        <w:spacing w:after="0" w:before="0"/>
-      </w:pPr>
-      <w:r>
-        <w:rPr>
-          <w:rFonts w:ascii="Calibri" w:cs="Calibri" w:eastAsia="Calibri" w:hAnsi="Calibri"/>
-          <w:sz w:val="22"/>
-          <w:szCs w:val="22"/>
-        </w:rPr>
-        <w:t xml:space="preserve"/>
-      </w:r>
-    </w:p>
-    <w:p>
-      <w:pPr>
-        <w:spacing w:after="0" w:before="0"/>
-      </w:pPr>
+        <w:t xml:space="preserve">Lieben Dank und beste Grüße</w:t>
+      </w:r>
     </w:p>
     <w:p>
       <w:pPr>
@@ -582,6 +508,23 @@
       <w:r>
         <w:rPr>
           <w:rFonts w:ascii="Calibri" w:cs="Calibri" w:eastAsia="Calibri" w:hAnsi="Calibri"/>
+          <w:b w:val="false"/>
+          <w:bCs w:val="false"/>
+          <w:i w:val="false"/>
+          <w:iCs w:val="false"/>
+          <w:sz w:val="22"/>
+          <w:szCs w:val="22"/>
+        </w:rPr>
+        <w:t xml:space="preserve">Geschäftsführer</w:t>
+      </w:r>
+    </w:p>
+    <w:p>
+      <w:pPr>
+        <w:spacing w:after="0" w:before="0"/>
+      </w:pPr>
+      <w:r>
+        <w:rPr>
+          <w:rFonts w:ascii="Calibri" w:cs="Calibri" w:eastAsia="Calibri" w:hAnsi="Calibri"/>
           <w:sz w:val="22"/>
           <w:szCs w:val="22"/>
         </w:rPr>
@@ -612,10 +555,44 @@
       <w:r>
         <w:rPr>
           <w:rFonts w:ascii="Calibri" w:cs="Calibri" w:eastAsia="Calibri" w:hAnsi="Calibri"/>
-          <w:sz w:val="22"/>
-          <w:szCs w:val="22"/>
-        </w:rPr>
-        <w:t xml:space="preserve"/>
+          <w:b w:val="false"/>
+          <w:bCs w:val="false"/>
+          <w:i w:val="false"/>
+          <w:iCs w:val="false"/>
+          <w:sz w:val="22"/>
+          <w:szCs w:val="22"/>
+        </w:rPr>
+        <w:t xml:space="preserve">Everything You Need</w:t>
+      </w:r>
+    </w:p>
+    <w:p>
+      <w:pPr>
+        <w:spacing w:after="0" w:before="0"/>
+      </w:pPr>
+      <w:r>
+        <w:rPr>
+          <w:rFonts w:ascii="Calibri" w:cs="Calibri" w:eastAsia="Calibri" w:hAnsi="Calibri"/>
+          <w:sz w:val="22"/>
+          <w:szCs w:val="22"/>
+        </w:rPr>
+        <w:t xml:space="preserve"/>
+      </w:r>
+    </w:p>
+    <w:p>
+      <w:pPr>
+        <w:spacing w:after="0" w:before="0"/>
+      </w:pPr>
+      <w:r>
+        <w:rPr>
+          <w:rFonts w:ascii="Calibri" w:cs="Calibri" w:eastAsia="Calibri" w:hAnsi="Calibri"/>
+          <w:b w:val="false"/>
+          <w:bCs w:val="false"/>
+          <w:i w:val="false"/>
+          <w:iCs w:val="false"/>
+          <w:sz w:val="22"/>
+          <w:szCs w:val="22"/>
+        </w:rPr>
+        <w:t xml:space="preserve">+49 176 34653744</w:t>
       </w:r>
     </w:p>
     <w:p>
@@ -662,7 +639,24 @@
           <w:sz w:val="22"/>
           <w:szCs w:val="22"/>
         </w:rPr>
-        <w:t xml:space="preserve">0176 34653744</w:t>
+        <w:t xml:space="preserve">Rittersbacher Straße 10</w:t>
+      </w:r>
+    </w:p>
+    <w:p>
+      <w:pPr>
+        <w:spacing w:after="0" w:before="0"/>
+      </w:pPr>
+      <w:r>
+        <w:rPr>
+          <w:rFonts w:ascii="Calibri" w:cs="Calibri" w:eastAsia="Calibri" w:hAnsi="Calibri"/>
+          <w:b w:val="false"/>
+          <w:bCs w:val="false"/>
+          <w:i w:val="false"/>
+          <w:iCs w:val="false"/>
+          <w:sz w:val="22"/>
+          <w:szCs w:val="22"/>
+        </w:rPr>
+        <w:t xml:space="preserve">91166 Georgensgmünd</w:t>
       </w:r>
     </w:p>
     <w:p>

</xml_diff>